<commit_message>
Add full set of 9 live website screenshots to Testing document and update all 4 review docs
</commit_message>
<xml_diff>
--- a/Second_Review_Documents/Topic3_Testing.docx
+++ b/Second_Review_Documents/Topic3_Testing.docx
@@ -58,7 +58,7 @@
           <w:color w:val="000000"/>
           <w:sz w:val="24"/>
         </w:rPr>
-        <w:t>Testing ensures the Community Lending Platform is reliable, secure, and user-friendly. The testing strategy follows the standard software engineering V-Model, connecting each stage of development with a corresponding testing phase. This structure allows defects to be caught early in development rather than late in production.</w:t>
+        <w:t>Testing ensures that the Community Lending Platform is reliable, secure, responsive, and easy to use. The project follows the standard software engineering V-Model, connecting every development stage directly with a corresponding verification and validation phase. This allows errors and edge cases to be identified and fixed early in the development lifecycle.</w:t>
       </w:r>
     </w:p>
     <w:p>
@@ -70,7 +70,7 @@
       <w:r>
         <w:drawing>
           <wp:inline xmlns:a="http://schemas.openxmlformats.org/drawingml/2006/main" xmlns:pic="http://schemas.openxmlformats.org/drawingml/2006/picture">
-            <wp:extent cx="3474720" cy="1634648"/>
+            <wp:extent cx="3840480" cy="1806716"/>
             <wp:docPr id="1" name="Picture 1"/>
             <wp:cNvGraphicFramePr>
               <a:graphicFrameLocks noChangeAspect="1"/>
@@ -91,7 +91,7 @@
                   <pic:spPr>
                     <a:xfrm>
                       <a:off x="0" y="0"/>
-                      <a:ext cx="3474720" cy="1634648"/>
+                      <a:ext cx="3840480" cy="1806716"/>
                     </a:xfrm>
                     <a:prstGeom prst="rect"/>
                   </pic:spPr>
@@ -154,7 +154,7 @@
           <w:color w:val="000000"/>
           <w:sz w:val="24"/>
         </w:rPr>
-        <w:t>Focuses on individual functions and modules in isolation. Validates password hashing, UUID generation for photo uploads, and input validation functions. Target: &gt;=80% code coverage.</w:t>
+        <w:t>Focuses on individual functions and components in isolation. Verifies PBKDF2 password hashing, UUID generation for photo uploads, and input validation functions. Target: &gt;=80% code coverage.</w:t>
       </w:r>
     </w:p>
     <w:p>
@@ -304,7 +304,7 @@
           <w:color w:val="000000"/>
           <w:sz w:val="28"/>
         </w:rPr>
-        <w:t>2. Verified Application Interfaces Under Test</w:t>
+        <w:t>2. Verified Live Application Interfaces Under Test</w:t>
       </w:r>
     </w:p>
     <w:p>
@@ -318,7 +318,7 @@
           <w:color w:val="000000"/>
           <w:sz w:val="24"/>
         </w:rPr>
-        <w:t>Before running end-to-end automated test suites, the platform's visual user interfaces and responsive layouts were verified across modern desktop and mobile browsers. Key application screens under test include user authentication and member dashboards:</w:t>
+        <w:t>Every screen of the web platform was comprehensively tested across desktop and mobile browsers. The live screenshots below document each user interface verified during system testing, covering member onboarding, catalog discovery, lending transactions, and account management:</w:t>
       </w:r>
     </w:p>
     <w:p>
@@ -330,7 +330,7 @@
       <w:r>
         <w:drawing>
           <wp:inline xmlns:a="http://schemas.openxmlformats.org/drawingml/2006/main" xmlns:pic="http://schemas.openxmlformats.org/drawingml/2006/picture">
-            <wp:extent cx="3474720" cy="2026920"/>
+            <wp:extent cx="4023360" cy="2682240"/>
             <wp:docPr id="2" name="Picture 2"/>
             <wp:cNvGraphicFramePr>
               <a:graphicFrameLocks noChangeAspect="1"/>
@@ -339,7 +339,7 @@
               <a:graphicData uri="http://schemas.openxmlformats.org/drawingml/2006/picture">
                 <pic:pic>
                   <pic:nvPicPr>
-                    <pic:cNvPr id="0" name="app_login_screen.png"/>
+                    <pic:cNvPr id="0" name="app_register_screen.png"/>
                     <pic:cNvPicPr/>
                   </pic:nvPicPr>
                   <pic:blipFill>
@@ -351,7 +351,7 @@
                   <pic:spPr>
                     <a:xfrm>
                       <a:off x="0" y="0"/>
-                      <a:ext cx="3474720" cy="2026920"/>
+                      <a:ext cx="4023360" cy="2682240"/>
                     </a:xfrm>
                     <a:prstGeom prst="rect"/>
                   </pic:spPr>
@@ -375,7 +375,7 @@
           <w:color w:val="000000"/>
           <w:sz w:val="20"/>
         </w:rPr>
-        <w:t>Figure 9: User Authentication Interface — Web Login Screen</w:t>
+        <w:t>Figure 9: User Registration and Account Creation Interface</w:t>
       </w:r>
     </w:p>
     <w:p>
@@ -389,7 +389,7 @@
           <w:color w:val="000000"/>
           <w:sz w:val="24"/>
         </w:rPr>
-        <w:t>The login interface provides secure member authentication with clear input validation, session cookie handling, and user-friendly error notifications.</w:t>
+        <w:t>The registration screen provides clean onboarding for community members. Tested behaviors include instant email format validation, password strength constraints, confirm password verification, and blocking duplicate email registrations with helpful alerts.</w:t>
       </w:r>
     </w:p>
     <w:p>
@@ -401,7 +401,7 @@
       <w:r>
         <w:drawing>
           <wp:inline xmlns:a="http://schemas.openxmlformats.org/drawingml/2006/main" xmlns:pic="http://schemas.openxmlformats.org/drawingml/2006/picture">
-            <wp:extent cx="3474720" cy="2171700"/>
+            <wp:extent cx="4023360" cy="2346960"/>
             <wp:docPr id="3" name="Picture 3"/>
             <wp:cNvGraphicFramePr>
               <a:graphicFrameLocks noChangeAspect="1"/>
@@ -410,7 +410,7 @@
               <a:graphicData uri="http://schemas.openxmlformats.org/drawingml/2006/picture">
                 <pic:pic>
                   <pic:nvPicPr>
-                    <pic:cNvPr id="0" name="app_dashboard_screen.png"/>
+                    <pic:cNvPr id="0" name="app_login_screen.png"/>
                     <pic:cNvPicPr/>
                   </pic:nvPicPr>
                   <pic:blipFill>
@@ -422,7 +422,7 @@
                   <pic:spPr>
                     <a:xfrm>
                       <a:off x="0" y="0"/>
-                      <a:ext cx="3474720" cy="2171700"/>
+                      <a:ext cx="4023360" cy="2346960"/>
                     </a:xfrm>
                     <a:prstGeom prst="rect"/>
                   </pic:spPr>
@@ -446,7 +446,7 @@
           <w:color w:val="000000"/>
           <w:sz w:val="20"/>
         </w:rPr>
-        <w:t>Figure 10: Community Lending Dashboard and Item Management Interface</w:t>
+        <w:t>Figure 10: User Authentication and Login Interface</w:t>
       </w:r>
     </w:p>
     <w:p>
@@ -460,7 +460,504 @@
           <w:color w:val="000000"/>
           <w:sz w:val="24"/>
         </w:rPr>
-        <w:t>The dashboard provides community members with real-time management of listed household items, active borrowing requests, and loan statuses.</w:t>
+        <w:t>The login interface handles secure member authentication. Tested behaviors include PBKDF2:SHA256 password hash verification, secure session cookie creation, clear error alerts for wrong credentials, and automatic redirection to requested protected pages.</w:t>
+      </w:r>
+    </w:p>
+    <w:p>
+      <w:pPr>
+        <w:keepNext/>
+        <w:spacing w:before="160" w:after="60"/>
+        <w:jc w:val="center"/>
+      </w:pPr>
+      <w:r>
+        <w:drawing>
+          <wp:inline xmlns:a="http://schemas.openxmlformats.org/drawingml/2006/main" xmlns:pic="http://schemas.openxmlformats.org/drawingml/2006/picture">
+            <wp:extent cx="4023360" cy="2682240"/>
+            <wp:docPr id="4" name="Picture 4"/>
+            <wp:cNvGraphicFramePr>
+              <a:graphicFrameLocks noChangeAspect="1"/>
+            </wp:cNvGraphicFramePr>
+            <a:graphic>
+              <a:graphicData uri="http://schemas.openxmlformats.org/drawingml/2006/picture">
+                <pic:pic>
+                  <pic:nvPicPr>
+                    <pic:cNvPr id="0" name="app_dashboard_screen.png"/>
+                    <pic:cNvPicPr/>
+                  </pic:nvPicPr>
+                  <pic:blipFill>
+                    <a:blip r:embed="rId13"/>
+                    <a:stretch>
+                      <a:fillRect/>
+                    </a:stretch>
+                  </pic:blipFill>
+                  <pic:spPr>
+                    <a:xfrm>
+                      <a:off x="0" y="0"/>
+                      <a:ext cx="4023360" cy="2682240"/>
+                    </a:xfrm>
+                    <a:prstGeom prst="rect"/>
+                  </pic:spPr>
+                </pic:pic>
+              </a:graphicData>
+            </a:graphic>
+          </wp:inline>
+        </w:drawing>
+      </w:r>
+    </w:p>
+    <w:p>
+      <w:pPr>
+        <w:keepNext/>
+        <w:spacing w:before="0" w:after="160"/>
+        <w:jc w:val="center"/>
+      </w:pPr>
+      <w:r>
+        <w:rPr>
+          <w:rFonts w:ascii="Times New Roman" w:hAnsi="Times New Roman"/>
+          <w:b/>
+          <w:color w:val="000000"/>
+          <w:sz w:val="20"/>
+        </w:rPr>
+        <w:t>Figure 11: Member Dashboard and Resource Inventory Interface</w:t>
+      </w:r>
+    </w:p>
+    <w:p>
+      <w:pPr>
+        <w:spacing w:line="360" w:lineRule="auto" w:after="80"/>
+        <w:jc w:val="both"/>
+      </w:pPr>
+      <w:r>
+        <w:rPr>
+          <w:rFonts w:ascii="Times New Roman" w:hAnsi="Times New Roman"/>
+          <w:color w:val="000000"/>
+          <w:sz w:val="24"/>
+        </w:rPr>
+        <w:t>The dashboard provides users with an instant snapshot of their community lending activity. Tested features include dynamic stat counters (items shared, pending requests, active loans), quick navigation buttons, and responsive grid layouts.</w:t>
+      </w:r>
+    </w:p>
+    <w:p>
+      <w:pPr>
+        <w:keepNext/>
+        <w:spacing w:before="160" w:after="60"/>
+        <w:jc w:val="center"/>
+      </w:pPr>
+      <w:r>
+        <w:drawing>
+          <wp:inline xmlns:a="http://schemas.openxmlformats.org/drawingml/2006/main" xmlns:pic="http://schemas.openxmlformats.org/drawingml/2006/picture">
+            <wp:extent cx="4023360" cy="2749296"/>
+            <wp:docPr id="5" name="Picture 5"/>
+            <wp:cNvGraphicFramePr>
+              <a:graphicFrameLocks noChangeAspect="1"/>
+            </wp:cNvGraphicFramePr>
+            <a:graphic>
+              <a:graphicData uri="http://schemas.openxmlformats.org/drawingml/2006/picture">
+                <pic:pic>
+                  <pic:nvPicPr>
+                    <pic:cNvPr id="0" name="app_browse_screen.png"/>
+                    <pic:cNvPicPr/>
+                  </pic:nvPicPr>
+                  <pic:blipFill>
+                    <a:blip r:embed="rId14"/>
+                    <a:stretch>
+                      <a:fillRect/>
+                    </a:stretch>
+                  </pic:blipFill>
+                  <pic:spPr>
+                    <a:xfrm>
+                      <a:off x="0" y="0"/>
+                      <a:ext cx="4023360" cy="2749296"/>
+                    </a:xfrm>
+                    <a:prstGeom prst="rect"/>
+                  </pic:spPr>
+                </pic:pic>
+              </a:graphicData>
+            </a:graphic>
+          </wp:inline>
+        </w:drawing>
+      </w:r>
+    </w:p>
+    <w:p>
+      <w:pPr>
+        <w:keepNext/>
+        <w:spacing w:before="0" w:after="160"/>
+        <w:jc w:val="center"/>
+      </w:pPr>
+      <w:r>
+        <w:rPr>
+          <w:rFonts w:ascii="Times New Roman" w:hAnsi="Times New Roman"/>
+          <w:b/>
+          <w:color w:val="000000"/>
+          <w:sz w:val="20"/>
+        </w:rPr>
+        <w:t>Figure 12: Neighborhood Resource Catalog and Search Interface</w:t>
+      </w:r>
+    </w:p>
+    <w:p>
+      <w:pPr>
+        <w:spacing w:line="360" w:lineRule="auto" w:after="80"/>
+        <w:jc w:val="both"/>
+      </w:pPr>
+      <w:r>
+        <w:rPr>
+          <w:rFonts w:ascii="Times New Roman" w:hAnsi="Times New Roman"/>
+          <w:color w:val="000000"/>
+          <w:sz w:val="24"/>
+        </w:rPr>
+        <w:t>The catalog screen allows members to find items shared by neighbors. Tested features include keyword search queries, category filtering (Books, Tools, Sports, Electronics, Household), real-time availability badges ('Available' vs 'Lent'), and quick item cards.</w:t>
+      </w:r>
+    </w:p>
+    <w:p>
+      <w:pPr>
+        <w:keepNext/>
+        <w:spacing w:before="160" w:after="60"/>
+        <w:jc w:val="center"/>
+      </w:pPr>
+      <w:r>
+        <w:drawing>
+          <wp:inline xmlns:a="http://schemas.openxmlformats.org/drawingml/2006/main" xmlns:pic="http://schemas.openxmlformats.org/drawingml/2006/picture">
+            <wp:extent cx="4023360" cy="2682240"/>
+            <wp:docPr id="6" name="Picture 6"/>
+            <wp:cNvGraphicFramePr>
+              <a:graphicFrameLocks noChangeAspect="1"/>
+            </wp:cNvGraphicFramePr>
+            <a:graphic>
+              <a:graphicData uri="http://schemas.openxmlformats.org/drawingml/2006/picture">
+                <pic:pic>
+                  <pic:nvPicPr>
+                    <pic:cNvPr id="0" name="app_item_details_screen.png"/>
+                    <pic:cNvPicPr/>
+                  </pic:nvPicPr>
+                  <pic:blipFill>
+                    <a:blip r:embed="rId15"/>
+                    <a:stretch>
+                      <a:fillRect/>
+                    </a:stretch>
+                  </pic:blipFill>
+                  <pic:spPr>
+                    <a:xfrm>
+                      <a:off x="0" y="0"/>
+                      <a:ext cx="4023360" cy="2682240"/>
+                    </a:xfrm>
+                    <a:prstGeom prst="rect"/>
+                  </pic:spPr>
+                </pic:pic>
+              </a:graphicData>
+            </a:graphic>
+          </wp:inline>
+        </w:drawing>
+      </w:r>
+    </w:p>
+    <w:p>
+      <w:pPr>
+        <w:keepNext/>
+        <w:spacing w:before="0" w:after="160"/>
+        <w:jc w:val="center"/>
+      </w:pPr>
+      <w:r>
+        <w:rPr>
+          <w:rFonts w:ascii="Times New Roman" w:hAnsi="Times New Roman"/>
+          <w:b/>
+          <w:color w:val="000000"/>
+          <w:sz w:val="20"/>
+        </w:rPr>
+        <w:t>Figure 13: Item Details and Borrow Request Interaction Interface</w:t>
+      </w:r>
+    </w:p>
+    <w:p>
+      <w:pPr>
+        <w:spacing w:line="360" w:lineRule="auto" w:after="80"/>
+        <w:jc w:val="both"/>
+      </w:pPr>
+      <w:r>
+        <w:rPr>
+          <w:rFonts w:ascii="Times New Roman" w:hAnsi="Times New Roman"/>
+          <w:color w:val="000000"/>
+          <w:sz w:val="24"/>
+        </w:rPr>
+        <w:t>The item details screen provides full information about a listed resource. Tested features include image display, owner contact details, availability checks, breadcrumb navigation, and submitting borrow requests with automatic duplicate request prevention.</w:t>
+      </w:r>
+    </w:p>
+    <w:p>
+      <w:pPr>
+        <w:keepNext/>
+        <w:spacing w:before="160" w:after="60"/>
+        <w:jc w:val="center"/>
+      </w:pPr>
+      <w:r>
+        <w:drawing>
+          <wp:inline xmlns:a="http://schemas.openxmlformats.org/drawingml/2006/main" xmlns:pic="http://schemas.openxmlformats.org/drawingml/2006/picture">
+            <wp:extent cx="4023360" cy="2682240"/>
+            <wp:docPr id="7" name="Picture 7"/>
+            <wp:cNvGraphicFramePr>
+              <a:graphicFrameLocks noChangeAspect="1"/>
+            </wp:cNvGraphicFramePr>
+            <a:graphic>
+              <a:graphicData uri="http://schemas.openxmlformats.org/drawingml/2006/picture">
+                <pic:pic>
+                  <pic:nvPicPr>
+                    <pic:cNvPr id="0" name="app_add_item_screen.png"/>
+                    <pic:cNvPicPr/>
+                  </pic:nvPicPr>
+                  <pic:blipFill>
+                    <a:blip r:embed="rId16"/>
+                    <a:stretch>
+                      <a:fillRect/>
+                    </a:stretch>
+                  </pic:blipFill>
+                  <pic:spPr>
+                    <a:xfrm>
+                      <a:off x="0" y="0"/>
+                      <a:ext cx="4023360" cy="2682240"/>
+                    </a:xfrm>
+                    <a:prstGeom prst="rect"/>
+                  </pic:spPr>
+                </pic:pic>
+              </a:graphicData>
+            </a:graphic>
+          </wp:inline>
+        </w:drawing>
+      </w:r>
+    </w:p>
+    <w:p>
+      <w:pPr>
+        <w:keepNext/>
+        <w:spacing w:before="0" w:after="160"/>
+        <w:jc w:val="center"/>
+      </w:pPr>
+      <w:r>
+        <w:rPr>
+          <w:rFonts w:ascii="Times New Roman" w:hAnsi="Times New Roman"/>
+          <w:b/>
+          <w:color w:val="000000"/>
+          <w:sz w:val="20"/>
+        </w:rPr>
+        <w:t>Figure 14: Item Listing Creation and Image Upload Interface</w:t>
+      </w:r>
+    </w:p>
+    <w:p>
+      <w:pPr>
+        <w:spacing w:line="360" w:lineRule="auto" w:after="80"/>
+        <w:jc w:val="both"/>
+      </w:pPr>
+      <w:r>
+        <w:rPr>
+          <w:rFonts w:ascii="Times New Roman" w:hAnsi="Times New Roman"/>
+          <w:color w:val="000000"/>
+          <w:sz w:val="24"/>
+        </w:rPr>
+        <w:t>The item creation screen enables community members to list household resources for sharing. Tested features include required field validation, category selection dropdowns, safe image uploads with UUID renaming, and sanitization of user-provided descriptions.</w:t>
+      </w:r>
+    </w:p>
+    <w:p>
+      <w:pPr>
+        <w:keepNext/>
+        <w:spacing w:before="160" w:after="60"/>
+        <w:jc w:val="center"/>
+      </w:pPr>
+      <w:r>
+        <w:drawing>
+          <wp:inline xmlns:a="http://schemas.openxmlformats.org/drawingml/2006/main" xmlns:pic="http://schemas.openxmlformats.org/drawingml/2006/picture">
+            <wp:extent cx="4023360" cy="2514600"/>
+            <wp:docPr id="8" name="Picture 8"/>
+            <wp:cNvGraphicFramePr>
+              <a:graphicFrameLocks noChangeAspect="1"/>
+            </wp:cNvGraphicFramePr>
+            <a:graphic>
+              <a:graphicData uri="http://schemas.openxmlformats.org/drawingml/2006/picture">
+                <pic:pic>
+                  <pic:nvPicPr>
+                    <pic:cNvPr id="0" name="app_received_requests_screen.png"/>
+                    <pic:cNvPicPr/>
+                  </pic:nvPicPr>
+                  <pic:blipFill>
+                    <a:blip r:embed="rId17"/>
+                    <a:stretch>
+                      <a:fillRect/>
+                    </a:stretch>
+                  </pic:blipFill>
+                  <pic:spPr>
+                    <a:xfrm>
+                      <a:off x="0" y="0"/>
+                      <a:ext cx="4023360" cy="2514600"/>
+                    </a:xfrm>
+                    <a:prstGeom prst="rect"/>
+                  </pic:spPr>
+                </pic:pic>
+              </a:graphicData>
+            </a:graphic>
+          </wp:inline>
+        </w:drawing>
+      </w:r>
+    </w:p>
+    <w:p>
+      <w:pPr>
+        <w:keepNext/>
+        <w:spacing w:before="0" w:after="160"/>
+        <w:jc w:val="center"/>
+      </w:pPr>
+      <w:r>
+        <w:rPr>
+          <w:rFonts w:ascii="Times New Roman" w:hAnsi="Times New Roman"/>
+          <w:b/>
+          <w:color w:val="000000"/>
+          <w:sz w:val="20"/>
+        </w:rPr>
+        <w:t>Figure 15: Received Borrow Requests and Owner Approval Interface</w:t>
+      </w:r>
+    </w:p>
+    <w:p>
+      <w:pPr>
+        <w:spacing w:line="360" w:lineRule="auto" w:after="80"/>
+        <w:jc w:val="both"/>
+      </w:pPr>
+      <w:r>
+        <w:rPr>
+          <w:rFonts w:ascii="Times New Roman" w:hAnsi="Times New Roman"/>
+          <w:color w:val="000000"/>
+          <w:sz w:val="24"/>
+        </w:rPr>
+        <w:t>The received requests screen allows item owners to manage incoming loan applications. Tested features include borrower detail cards, request timestamps, and single-click 'Approve' and 'Decline' actions that update item availability instantly in the database.</w:t>
+      </w:r>
+    </w:p>
+    <w:p>
+      <w:pPr>
+        <w:keepNext/>
+        <w:spacing w:before="160" w:after="60"/>
+        <w:jc w:val="center"/>
+      </w:pPr>
+      <w:r>
+        <w:drawing>
+          <wp:inline xmlns:a="http://schemas.openxmlformats.org/drawingml/2006/main" xmlns:pic="http://schemas.openxmlformats.org/drawingml/2006/picture">
+            <wp:extent cx="4023360" cy="2514600"/>
+            <wp:docPr id="9" name="Picture 9"/>
+            <wp:cNvGraphicFramePr>
+              <a:graphicFrameLocks noChangeAspect="1"/>
+            </wp:cNvGraphicFramePr>
+            <a:graphic>
+              <a:graphicData uri="http://schemas.openxmlformats.org/drawingml/2006/picture">
+                <pic:pic>
+                  <pic:nvPicPr>
+                    <pic:cNvPr id="0" name="app_my_requests_screen.png"/>
+                    <pic:cNvPicPr/>
+                  </pic:nvPicPr>
+                  <pic:blipFill>
+                    <a:blip r:embed="rId18"/>
+                    <a:stretch>
+                      <a:fillRect/>
+                    </a:stretch>
+                  </pic:blipFill>
+                  <pic:spPr>
+                    <a:xfrm>
+                      <a:off x="0" y="0"/>
+                      <a:ext cx="4023360" cy="2514600"/>
+                    </a:xfrm>
+                    <a:prstGeom prst="rect"/>
+                  </pic:spPr>
+                </pic:pic>
+              </a:graphicData>
+            </a:graphic>
+          </wp:inline>
+        </w:drawing>
+      </w:r>
+    </w:p>
+    <w:p>
+      <w:pPr>
+        <w:keepNext/>
+        <w:spacing w:before="0" w:after="160"/>
+        <w:jc w:val="center"/>
+      </w:pPr>
+      <w:r>
+        <w:rPr>
+          <w:rFonts w:ascii="Times New Roman" w:hAnsi="Times New Roman"/>
+          <w:b/>
+          <w:color w:val="000000"/>
+          <w:sz w:val="20"/>
+        </w:rPr>
+        <w:t>Figure 16: Active Borrow Requests and Loan Tracking Interface</w:t>
+      </w:r>
+    </w:p>
+    <w:p>
+      <w:pPr>
+        <w:spacing w:line="360" w:lineRule="auto" w:after="80"/>
+        <w:jc w:val="both"/>
+      </w:pPr>
+      <w:r>
+        <w:rPr>
+          <w:rFonts w:ascii="Times New Roman" w:hAnsi="Times New Roman"/>
+          <w:color w:val="000000"/>
+          <w:sz w:val="24"/>
+        </w:rPr>
+        <w:t>The active requests screen enables borrowers to track their loan requests. Tested features include live status tags ('Awaiting Approval', 'Currently Borrowed'), owner contact details, and confirming item returns to make resources available again.</w:t>
+      </w:r>
+    </w:p>
+    <w:p>
+      <w:pPr>
+        <w:keepNext/>
+        <w:spacing w:before="160" w:after="60"/>
+        <w:jc w:val="center"/>
+      </w:pPr>
+      <w:r>
+        <w:drawing>
+          <wp:inline xmlns:a="http://schemas.openxmlformats.org/drawingml/2006/main" xmlns:pic="http://schemas.openxmlformats.org/drawingml/2006/picture">
+            <wp:extent cx="4023360" cy="2514600"/>
+            <wp:docPr id="10" name="Picture 10"/>
+            <wp:cNvGraphicFramePr>
+              <a:graphicFrameLocks noChangeAspect="1"/>
+            </wp:cNvGraphicFramePr>
+            <a:graphic>
+              <a:graphicData uri="http://schemas.openxmlformats.org/drawingml/2006/picture">
+                <pic:pic>
+                  <pic:nvPicPr>
+                    <pic:cNvPr id="0" name="app_profile_screen.png"/>
+                    <pic:cNvPicPr/>
+                  </pic:nvPicPr>
+                  <pic:blipFill>
+                    <a:blip r:embed="rId19"/>
+                    <a:stretch>
+                      <a:fillRect/>
+                    </a:stretch>
+                  </pic:blipFill>
+                  <pic:spPr>
+                    <a:xfrm>
+                      <a:off x="0" y="0"/>
+                      <a:ext cx="4023360" cy="2514600"/>
+                    </a:xfrm>
+                    <a:prstGeom prst="rect"/>
+                  </pic:spPr>
+                </pic:pic>
+              </a:graphicData>
+            </a:graphic>
+          </wp:inline>
+        </w:drawing>
+      </w:r>
+    </w:p>
+    <w:p>
+      <w:pPr>
+        <w:keepNext/>
+        <w:spacing w:before="0" w:after="160"/>
+        <w:jc w:val="center"/>
+      </w:pPr>
+      <w:r>
+        <w:rPr>
+          <w:rFonts w:ascii="Times New Roman" w:hAnsi="Times New Roman"/>
+          <w:b/>
+          <w:color w:val="000000"/>
+          <w:sz w:val="20"/>
+        </w:rPr>
+        <w:t>Figure 17: User Profile and Community Sharing Statistics Interface</w:t>
+      </w:r>
+    </w:p>
+    <w:p>
+      <w:pPr>
+        <w:spacing w:line="360" w:lineRule="auto" w:after="80"/>
+        <w:jc w:val="both"/>
+      </w:pPr>
+      <w:r>
+        <w:rPr>
+          <w:rFonts w:ascii="Times New Roman" w:hAnsi="Times New Roman"/>
+          <w:color w:val="000000"/>
+          <w:sz w:val="24"/>
+        </w:rPr>
+        <w:t>The member profile screen displays verified neighbor credentials and participation statistics. Tested features include profile information display, sharing metric cards (items shared and borrowed), and navigation to account settings.</w:t>
       </w:r>
     </w:p>
     <w:p>
@@ -489,7 +986,7 @@
           <w:color w:val="000000"/>
           <w:sz w:val="24"/>
         </w:rPr>
-        <w:t>Automated testing was conducted using the pytest testing framework. All fifteen functional test suites were executed sequentially, validating member authentication, catalog operations, search algorithms, and the complete lending request lifecycle state machine:</w:t>
+        <w:t>Automated test execution was conducted using the pytest testing framework. All fifteen functional test suites were executed sequentially, validating member authentication, catalog operations, search algorithms, and the complete lending request lifecycle state machine:</w:t>
       </w:r>
     </w:p>
     <w:p>
@@ -501,8 +998,8 @@
       <w:r>
         <w:drawing>
           <wp:inline xmlns:a="http://schemas.openxmlformats.org/drawingml/2006/main" xmlns:pic="http://schemas.openxmlformats.org/drawingml/2006/picture">
-            <wp:extent cx="3840480" cy="2141651"/>
-            <wp:docPr id="4" name="Picture 4"/>
+            <wp:extent cx="4023360" cy="2243635"/>
+            <wp:docPr id="11" name="Picture 11"/>
             <wp:cNvGraphicFramePr>
               <a:graphicFrameLocks noChangeAspect="1"/>
             </wp:cNvGraphicFramePr>
@@ -514,7 +1011,7 @@
                     <pic:cNvPicPr/>
                   </pic:nvPicPr>
                   <pic:blipFill>
-                    <a:blip r:embed="rId13"/>
+                    <a:blip r:embed="rId20"/>
                     <a:stretch>
                       <a:fillRect/>
                     </a:stretch>
@@ -522,7 +1019,7 @@
                   <pic:spPr>
                     <a:xfrm>
                       <a:off x="0" y="0"/>
-                      <a:ext cx="3840480" cy="2141651"/>
+                      <a:ext cx="4023360" cy="2243635"/>
                     </a:xfrm>
                     <a:prstGeom prst="rect"/>
                   </pic:spPr>
@@ -546,7 +1043,7 @@
           <w:color w:val="000000"/>
           <w:sz w:val="20"/>
         </w:rPr>
-        <w:t>Figure 11: Automated Test Suite Execution Results (pytest)</w:t>
+        <w:t>Figure 18: Automated Test Suite Execution Results (pytest)</w:t>
       </w:r>
     </w:p>
     <w:p>
@@ -560,7 +1057,7 @@
           <w:color w:val="000000"/>
           <w:sz w:val="24"/>
         </w:rPr>
-        <w:t>As shown in Figure 11, all 15 automated test suites executed successfully in 0.42 seconds with zero test failures, zero regressions, and 100% test completion.</w:t>
+        <w:t>As shown in Figure 18, all 15 automated test suites executed successfully in 0.42 seconds with zero test failures, zero regressions, and 100% test completion.</w:t>
       </w:r>
     </w:p>
     <w:p>

</xml_diff>